<commit_message>
update comments with biological context
</commit_message>
<xml_diff>
--- a/Paper.docx
+++ b/Paper.docx
@@ -12,45 +12,24 @@
         <w:rPr>
           <w:rFonts w:ascii="Times New Roman" w:hAnsi="Times New Roman" w:cs="Times New Roman"/>
         </w:rPr>
-        <w:fldChar w:fldCharType="begin"/>
-      </w:r>
-      <w:r>
-        <w:rPr>
-          <w:rFonts w:ascii="Times New Roman" w:hAnsi="Times New Roman" w:cs="Times New Roman"/>
-        </w:rPr>
-        <w:instrText>HYPERLINK "</w:instrText>
-      </w:r>
-      <w:r>
-        <w:rPr>
-          <w:rFonts w:ascii="Times New Roman" w:hAnsi="Times New Roman" w:cs="Times New Roman"/>
-        </w:rPr>
-        <w:instrText>https://pubmed.ncbi.nlm.nih.gov/32552891/</w:instrText>
-      </w:r>
-      <w:r>
-        <w:rPr>
-          <w:rFonts w:ascii="Times New Roman" w:hAnsi="Times New Roman" w:cs="Times New Roman"/>
-        </w:rPr>
-        <w:instrText>"</w:instrText>
-      </w:r>
-      <w:r>
-        <w:rPr>
-          <w:rFonts w:ascii="Times New Roman" w:hAnsi="Times New Roman" w:cs="Times New Roman"/>
-        </w:rPr>
-        <w:fldChar w:fldCharType="separate"/>
-      </w:r>
-      <w:r>
-        <w:rPr>
-          <w:rStyle w:val="Hyperlink"/>
-          <w:rFonts w:ascii="Times New Roman" w:hAnsi="Times New Roman" w:cs="Times New Roman"/>
-        </w:rPr>
-        <w:t>https://pubmed.ncbi.nlm.nih.gov/32552891/</w:t>
-      </w:r>
-      <w:r>
-        <w:rPr>
-          <w:rFonts w:ascii="Times New Roman" w:hAnsi="Times New Roman" w:cs="Times New Roman"/>
-        </w:rPr>
-        <w:fldChar w:fldCharType="end"/>
-      </w:r>
+        <w:br w:type="page"/>
+      </w:r>
+    </w:p>
+    <w:p>
+      <w:pPr>
+        <w:rPr>
+          <w:rFonts w:ascii="Times New Roman" w:hAnsi="Times New Roman" w:cs="Times New Roman"/>
+        </w:rPr>
+      </w:pPr>
+      <w:hyperlink r:id="rId5" w:history="1">
+        <w:r>
+          <w:rPr>
+            <w:rStyle w:val="Hyperlink"/>
+            <w:rFonts w:ascii="Times New Roman" w:hAnsi="Times New Roman" w:cs="Times New Roman"/>
+          </w:rPr>
+          <w:t>https://pubmed.ncbi.nlm.nih.gov/32552891/</w:t>
+        </w:r>
+      </w:hyperlink>
     </w:p>
     <w:p>
       <w:pPr>
@@ -71,7 +50,7 @@
           <w:rFonts w:ascii="Times New Roman" w:hAnsi="Times New Roman" w:cs="Times New Roman"/>
         </w:rPr>
       </w:pPr>
-      <w:hyperlink r:id="rId5" w:history="1">
+      <w:hyperlink r:id="rId6" w:history="1">
         <w:r>
           <w:rPr>
             <w:rStyle w:val="Hyperlink"/>
@@ -100,7 +79,7 @@
           <w:rFonts w:ascii="Times New Roman" w:hAnsi="Times New Roman" w:cs="Times New Roman"/>
         </w:rPr>
       </w:pPr>
-      <w:hyperlink r:id="rId6" w:history="1">
+      <w:hyperlink r:id="rId7" w:history="1">
         <w:r>
           <w:rPr>
             <w:rStyle w:val="Hyperlink"/>
@@ -129,7 +108,7 @@
           <w:rFonts w:ascii="Times New Roman" w:hAnsi="Times New Roman" w:cs="Times New Roman"/>
         </w:rPr>
       </w:pPr>
-      <w:hyperlink r:id="rId7" w:history="1">
+      <w:hyperlink r:id="rId8" w:history="1">
         <w:r>
           <w:rPr>
             <w:rStyle w:val="Hyperlink"/>
@@ -178,7 +157,7 @@
           <w:rFonts w:ascii="Times New Roman" w:hAnsi="Times New Roman" w:cs="Times New Roman"/>
         </w:rPr>
       </w:pPr>
-      <w:hyperlink r:id="rId8" w:history="1">
+      <w:hyperlink r:id="rId9" w:history="1">
         <w:r>
           <w:rPr>
             <w:rStyle w:val="Hyperlink"/>
@@ -343,7 +322,7 @@
           <w:rFonts w:ascii="Times New Roman" w:hAnsi="Times New Roman" w:cs="Times New Roman"/>
         </w:rPr>
       </w:pPr>
-      <w:hyperlink r:id="rId9" w:history="1">
+      <w:hyperlink r:id="rId10" w:history="1">
         <w:r>
           <w:rPr>
             <w:rStyle w:val="Hyperlink"/>
@@ -371,49 +350,6 @@
         </w:rPr>
         <w:br/>
       </w:r>
-      <w:hyperlink r:id="rId10" w:history="1">
-        <w:r>
-          <w:rPr>
-            <w:rStyle w:val="Hyperlink"/>
-            <w:rFonts w:ascii="Times New Roman" w:hAnsi="Times New Roman" w:cs="Times New Roman"/>
-          </w:rPr>
-          <w:t>https://pmc.ncbi.nlm.nih.gov/articles/PMC6171532/</w:t>
-        </w:r>
-      </w:hyperlink>
-    </w:p>
-    <w:p>
-      <w:pPr>
-        <w:rPr>
-          <w:rFonts w:ascii="Times New Roman" w:hAnsi="Times New Roman" w:cs="Times New Roman"/>
-        </w:rPr>
-      </w:pPr>
-      <w:r>
-        <w:rPr>
-          <w:rFonts w:ascii="Times New Roman" w:hAnsi="Times New Roman" w:cs="Times New Roman"/>
-        </w:rPr>
-        <w:t xml:space="preserve">Morrow and Moss (2006) report on data from the </w:t>
-      </w:r>
-      <w:proofErr w:type="spellStart"/>
-      <w:r>
-        <w:rPr>
-          <w:rFonts w:ascii="Times New Roman" w:hAnsi="Times New Roman" w:cs="Times New Roman"/>
-        </w:rPr>
-        <w:t>Garki</w:t>
-      </w:r>
-      <w:proofErr w:type="spellEnd"/>
-      <w:r>
-        <w:rPr>
-          <w:rFonts w:ascii="Times New Roman" w:hAnsi="Times New Roman" w:cs="Times New Roman"/>
-        </w:rPr>
-        <w:t xml:space="preserve"> study, conducted in a region of high malaria transmission in Nigeria in the 1970s. Among adults, 29.0% of the population was AS, while 70.2% were AA. Among newborns, 23.6% were AS and 73.8% AA. Entering these figures in the equation above gives a value of β = .775. More generally, Morrow and Moss report that the prevalence of the sickle cell trait in West Africa trait rises from 20–24% among newborns to 26–29% among adults.14</w:t>
-      </w:r>
-    </w:p>
-    <w:p>
-      <w:pPr>
-        <w:rPr>
-          <w:rFonts w:ascii="Times New Roman" w:hAnsi="Times New Roman" w:cs="Times New Roman"/>
-        </w:rPr>
-      </w:pPr>
       <w:hyperlink r:id="rId11" w:history="1">
         <w:r>
           <w:rPr>
@@ -434,6 +370,49 @@
         <w:rPr>
           <w:rFonts w:ascii="Times New Roman" w:hAnsi="Times New Roman" w:cs="Times New Roman"/>
         </w:rPr>
+        <w:t xml:space="preserve">Morrow and Moss (2006) report on data from the </w:t>
+      </w:r>
+      <w:proofErr w:type="spellStart"/>
+      <w:r>
+        <w:rPr>
+          <w:rFonts w:ascii="Times New Roman" w:hAnsi="Times New Roman" w:cs="Times New Roman"/>
+        </w:rPr>
+        <w:t>Garki</w:t>
+      </w:r>
+      <w:proofErr w:type="spellEnd"/>
+      <w:r>
+        <w:rPr>
+          <w:rFonts w:ascii="Times New Roman" w:hAnsi="Times New Roman" w:cs="Times New Roman"/>
+        </w:rPr>
+        <w:t xml:space="preserve"> study, conducted in a region of high malaria transmission in Nigeria in the 1970s. Among adults, 29.0% of the population was AS, while 70.2% were AA. Among newborns, 23.6% were AS and 73.8% AA. Entering these figures in the equation above gives a value of β = .775. More generally, Morrow and Moss report that the prevalence of the sickle cell trait in West Africa trait rises from 20–24% among newborns to 26–29% among adults.14</w:t>
+      </w:r>
+    </w:p>
+    <w:p>
+      <w:pPr>
+        <w:rPr>
+          <w:rFonts w:ascii="Times New Roman" w:hAnsi="Times New Roman" w:cs="Times New Roman"/>
+        </w:rPr>
+      </w:pPr>
+      <w:hyperlink r:id="rId12" w:history="1">
+        <w:r>
+          <w:rPr>
+            <w:rStyle w:val="Hyperlink"/>
+            <w:rFonts w:ascii="Times New Roman" w:hAnsi="Times New Roman" w:cs="Times New Roman"/>
+          </w:rPr>
+          <w:t>https://pmc.ncbi.nlm.nih.gov/articles/PMC6171532/</w:t>
+        </w:r>
+      </w:hyperlink>
+    </w:p>
+    <w:p>
+      <w:pPr>
+        <w:rPr>
+          <w:rFonts w:ascii="Times New Roman" w:hAnsi="Times New Roman" w:cs="Times New Roman"/>
+        </w:rPr>
+      </w:pPr>
+      <w:r>
+        <w:rPr>
+          <w:rFonts w:ascii="Times New Roman" w:hAnsi="Times New Roman" w:cs="Times New Roman"/>
+        </w:rPr>
         <w:t>Most SS do not naturally survive to adulthood</w:t>
       </w:r>
       <w:r>
@@ -461,7 +440,7 @@
           <w:rFonts w:ascii="Times New Roman" w:hAnsi="Times New Roman" w:cs="Times New Roman"/>
         </w:rPr>
       </w:pPr>
-      <w:hyperlink r:id="rId12" w:history="1">
+      <w:hyperlink r:id="rId13" w:history="1">
         <w:r>
           <w:rPr>
             <w:rStyle w:val="Hyperlink"/>
@@ -504,6 +483,120 @@
           <w:rFonts w:ascii="Times New Roman" w:hAnsi="Times New Roman" w:cs="Times New Roman"/>
         </w:rPr>
       </w:pPr>
+      <w:hyperlink r:id="rId14" w:history="1">
+        <w:r>
+          <w:rPr>
+            <w:rStyle w:val="Hyperlink"/>
+            <w:rFonts w:ascii="Times New Roman" w:hAnsi="Times New Roman" w:cs="Times New Roman"/>
+          </w:rPr>
+          <w:t>https://ojs.usp-pl.com/index.php/ADVANCES-IN-HIGHER-EDUCATION/article/viewFile/5142/4767</w:t>
+        </w:r>
+      </w:hyperlink>
+    </w:p>
+    <w:p>
+      <w:pPr>
+        <w:rPr>
+          <w:rFonts w:ascii="Times New Roman" w:hAnsi="Times New Roman" w:cs="Times New Roman"/>
+        </w:rPr>
+      </w:pPr>
+      <w:r>
+        <w:rPr>
+          <w:rFonts w:ascii="Times New Roman" w:hAnsi="Times New Roman" w:cs="Times New Roman"/>
+        </w:rPr>
+        <w:t>Leslie model</w:t>
+      </w:r>
+      <w:r>
+        <w:rPr>
+          <w:rFonts w:ascii="Times New Roman" w:hAnsi="Times New Roman" w:cs="Times New Roman"/>
+        </w:rPr>
+        <w:t xml:space="preserve"> adapted</w:t>
+      </w:r>
+    </w:p>
+    <w:p>
+      <w:pPr>
+        <w:rPr>
+          <w:rFonts w:ascii="Times New Roman" w:hAnsi="Times New Roman" w:cs="Times New Roman"/>
+        </w:rPr>
+      </w:pPr>
+      <w:hyperlink r:id="rId15" w:history="1">
+        <w:r>
+          <w:rPr>
+            <w:rStyle w:val="Hyperlink"/>
+            <w:rFonts w:ascii="Times New Roman" w:hAnsi="Times New Roman" w:cs="Times New Roman"/>
+          </w:rPr>
+          <w:t>https://www.jstor.org/stable/2332297</w:t>
+        </w:r>
+      </w:hyperlink>
+    </w:p>
+    <w:p>
+      <w:pPr>
+        <w:rPr>
+          <w:rFonts w:ascii="Times New Roman" w:hAnsi="Times New Roman" w:cs="Times New Roman"/>
+        </w:rPr>
+      </w:pPr>
+      <w:r>
+        <w:rPr>
+          <w:rFonts w:ascii="Times New Roman" w:hAnsi="Times New Roman" w:cs="Times New Roman"/>
+        </w:rPr>
+        <w:t>original Leslie model</w:t>
+      </w:r>
+    </w:p>
+    <w:p>
+      <w:pPr>
+        <w:rPr>
+          <w:rFonts w:ascii="Times New Roman" w:hAnsi="Times New Roman" w:cs="Times New Roman"/>
+        </w:rPr>
+      </w:pPr>
+      <w:hyperlink r:id="rId16" w:history="1">
+        <w:r>
+          <w:rPr>
+            <w:rStyle w:val="Hyperlink"/>
+            <w:rFonts w:ascii="Times New Roman" w:hAnsi="Times New Roman" w:cs="Times New Roman"/>
+          </w:rPr>
+          <w:t>https://www.sciencedirect.com/science/article/abs/pii/002555648990031X</w:t>
+        </w:r>
+      </w:hyperlink>
+    </w:p>
+    <w:p>
+      <w:pPr>
+        <w:rPr>
+          <w:rFonts w:ascii="Times New Roman" w:hAnsi="Times New Roman" w:cs="Times New Roman"/>
+        </w:rPr>
+      </w:pPr>
+      <w:r>
+        <w:rPr>
+          <w:rFonts w:ascii="Times New Roman" w:hAnsi="Times New Roman" w:cs="Times New Roman"/>
+        </w:rPr>
+        <w:t>change fertility to stabilize population</w:t>
+      </w:r>
+    </w:p>
+    <w:p>
+      <w:pPr>
+        <w:rPr>
+          <w:rFonts w:ascii="Times New Roman" w:hAnsi="Times New Roman" w:cs="Times New Roman"/>
+        </w:rPr>
+      </w:pPr>
+    </w:p>
+    <w:p>
+      <w:pPr>
+        <w:rPr>
+          <w:rFonts w:ascii="Times New Roman" w:hAnsi="Times New Roman" w:cs="Times New Roman"/>
+        </w:rPr>
+      </w:pPr>
+      <w:proofErr w:type="spellStart"/>
+      <w:r>
+        <w:rPr>
+          <w:rFonts w:ascii="Times New Roman" w:hAnsi="Times New Roman" w:cs="Times New Roman"/>
+        </w:rPr>
+        <w:t>Hardyweinberg</w:t>
+      </w:r>
+      <w:proofErr w:type="spellEnd"/>
+      <w:r>
+        <w:rPr>
+          <w:rFonts w:ascii="Times New Roman" w:hAnsi="Times New Roman" w:cs="Times New Roman"/>
+        </w:rPr>
+        <w:t xml:space="preserve"> equilibrium, mendelian genetics</w:t>
+      </w:r>
     </w:p>
     <w:p>
       <w:pPr>

</xml_diff>